<commit_message>
feat: revert to exactly 4 projects based on requirements
</commit_message>
<xml_diff>
--- a/Dhanush Dhamodharan Resume March Updated.docx
+++ b/Dhanush Dhamodharan Resume March Updated.docx
@@ -3337,6 +3337,12 @@
     <w:p>
       <w:pPr>
         <w:pStyle w:val="NormalWeb"/>
+        <w:rPr>
+          <w:b/>
+          <w:bCs/>
+          <w:sz w:val="22"/>
+          <w:szCs w:val="22"/>
+        </w:rPr>
       </w:pPr>
       <w:proofErr w:type="spellStart"/>
       <w:r>
@@ -3352,6 +3358,22 @@
           <w:rStyle w:val="Strong"/>
         </w:rPr>
         <w:t xml:space="preserve"> AI – Intelligent Student Attendance &amp; Management System</w:t>
+      </w:r>
+      <w:r>
+        <w:rPr>
+          <w:rStyle w:val="Strong"/>
+        </w:rPr>
+        <w:t xml:space="preserve">                                 </w:t>
+      </w:r>
+      <w:r>
+        <w:rPr>
+          <w:rStyle w:val="Strong"/>
+          <w:b w:val="0"/>
+          <w:bCs w:val="0"/>
+          <w:sz w:val="22"/>
+          <w:szCs w:val="22"/>
+        </w:rPr>
+        <w:t xml:space="preserve">April 2026 </w:t>
       </w:r>
     </w:p>
     <w:p>
@@ -3372,7 +3394,99 @@
     <w:p>
       <w:pPr>
         <w:rPr>
-          <w:sz w:val="17"/>
+          <w:szCs w:val="32"/>
+        </w:rPr>
+      </w:pPr>
+      <w:r>
+        <w:rPr>
+          <w:b/>
+          <w:bCs/>
+          <w:sz w:val="24"/>
+          <w:szCs w:val="36"/>
+        </w:rPr>
+        <w:t>Vel</w:t>
+      </w:r>
+      <w:r>
+        <w:rPr>
+          <w:b/>
+          <w:bCs/>
+          <w:sz w:val="24"/>
+          <w:szCs w:val="36"/>
+        </w:rPr>
+        <w:t xml:space="preserve"> </w:t>
+      </w:r>
+      <w:r>
+        <w:rPr>
+          <w:b/>
+          <w:bCs/>
+          <w:sz w:val="24"/>
+          <w:szCs w:val="36"/>
+        </w:rPr>
+        <w:t>One ERP AI – Intelligent Wholesale Billing &amp; Inventory Management Platform</w:t>
+      </w:r>
+      <w:r>
+        <w:rPr>
+          <w:b/>
+          <w:bCs/>
+          <w:sz w:val="24"/>
+          <w:szCs w:val="36"/>
+        </w:rPr>
+        <w:t xml:space="preserve">        </w:t>
+      </w:r>
+      <w:r>
+        <w:rPr>
+          <w:szCs w:val="32"/>
+        </w:rPr>
+        <w:t>May 2026</w:t>
+      </w:r>
+    </w:p>
+    <w:p>
+      <w:pPr>
+        <w:rPr>
+          <w:b/>
+          <w:bCs/>
+          <w:sz w:val="24"/>
+          <w:szCs w:val="36"/>
+        </w:rPr>
+      </w:pPr>
+    </w:p>
+    <w:p>
+      <w:pPr>
+        <w:pStyle w:val="ListParagraph"/>
+        <w:numPr>
+          <w:ilvl w:val="0"/>
+          <w:numId w:val="3"/>
+        </w:numPr>
+        <w:tabs>
+          <w:tab w:val="left" w:pos="900"/>
+        </w:tabs>
+        <w:rPr>
+          <w:i/>
+          <w:iCs/>
+          <w:sz w:val="24"/>
+          <w:szCs w:val="40"/>
+          <w:lang w:val="en-IN"/>
+        </w:rPr>
+      </w:pPr>
+      <w:r>
+        <w:rPr>
+          <w:i/>
+          <w:iCs/>
+          <w:sz w:val="24"/>
+          <w:szCs w:val="40"/>
+          <w:lang w:val="en-IN"/>
+        </w:rPr>
+        <w:t>AI-powered enterprise platform for wholesale billing, inventory management, customer ledger tracking, and automated WhatsApp invoicing.</w:t>
+      </w:r>
+    </w:p>
+    <w:p>
+      <w:pPr>
+        <w:tabs>
+          <w:tab w:val="left" w:pos="900"/>
+        </w:tabs>
+        <w:rPr>
+          <w:sz w:val="28"/>
+          <w:szCs w:val="40"/>
         </w:rPr>
       </w:pPr>
     </w:p>
@@ -4335,7 +4449,7 @@
   <w:abstractNum w:abstractNumId="8" w15:restartNumberingAfterBreak="0">
     <w:nsid w:val="6647076C"/>
     <w:multiLevelType w:val="hybridMultilevel"/>
-    <w:tmpl w:val="EC32F56C"/>
+    <w:tmpl w:val="90DE1566"/>
     <w:lvl w:ilvl="0" w:tplc="40090001">
       <w:start w:val="1"/>
       <w:numFmt w:val="bullet"/>
@@ -5245,7 +5359,6 @@
   <w:style w:type="character" w:default="1" w:styleId="DefaultParagraphFont">
     <w:name w:val="Default Paragraph Font"/>
     <w:uiPriority w:val="1"/>
-    <w:semiHidden/>
     <w:unhideWhenUsed/>
   </w:style>
   <w:style w:type="table" w:default="1" w:styleId="TableNormal">

</xml_diff>